<commit_message>
four advantages of pipes over temporary files
</commit_message>
<xml_diff>
--- a/6.S081/Vocabulary of 6.S081.docx
+++ b/6.S081/Vocabulary of 6.S081.docx
@@ -1,11 +1,11 @@
 
 <file path=word/document.xml><?xml version="1.0" encoding="utf-8"?>
-<w:document xmlns:wpc="http://schemas.microsoft.com/office/word/2010/wordprocessingCanvas" xmlns:mc="http://schemas.openxmlformats.org/markup-compatibility/2006" xmlns:o="urn:schemas-microsoft-com:office:office" xmlns:r="http://schemas.openxmlformats.org/officeDocument/2006/relationships" xmlns:m="http://schemas.openxmlformats.org/officeDocument/2006/math" xmlns:v="urn:schemas-microsoft-com:vml" xmlns:wp14="http://schemas.microsoft.com/office/word/2010/wordprocessingDrawing" xmlns:wp="http://schemas.openxmlformats.org/drawingml/2006/wordprocessingDrawing" xmlns:w10="urn:schemas-microsoft-com:office:word" xmlns:w="http://schemas.openxmlformats.org/wordprocessingml/2006/main" xmlns:w14="http://schemas.microsoft.com/office/word/2010/wordml" xmlns:wpg="http://schemas.microsoft.com/office/word/2010/wordprocessingGroup" xmlns:wpi="http://schemas.microsoft.com/office/word/2010/wordprocessingInk" xmlns:wne="http://schemas.microsoft.com/office/word/2006/wordml" xmlns:wps="http://schemas.microsoft.com/office/word/2010/wordprocessingShape" mc:Ignorable="w14 wp14">
+<w:document xmlns:ve="http://schemas.openxmlformats.org/markup-compatibility/2006" xmlns:o="urn:schemas-microsoft-com:office:office" xmlns:r="http://schemas.openxmlformats.org/officeDocument/2006/relationships" xmlns:m="http://schemas.openxmlformats.org/officeDocument/2006/math" xmlns:v="urn:schemas-microsoft-com:vml" xmlns:wp="http://schemas.openxmlformats.org/drawingml/2006/wordprocessingDrawing" xmlns:w10="urn:schemas-microsoft-com:office:word" xmlns:w="http://schemas.openxmlformats.org/wordprocessingml/2006/main" xmlns:wne="http://schemas.microsoft.com/office/word/2006/wordml">
   <w:body>
     <w:p>
       <w:pPr>
         <w:rPr>
-          <w:rFonts w:ascii="Times New Roman" w:hAnsi="Times New Roman" w:cs="Times New Roman" w:hint="eastAsia"/>
+          <w:rFonts w:ascii="Times New Roman" w:hAnsi="Times New Roman" w:cs="Times New Roman"/>
         </w:rPr>
       </w:pPr>
       <w:r>
@@ -24,7 +24,7 @@
       </w:r>
       <w:r>
         <w:rPr>
-          <w:rFonts w:ascii="Times New Roman" w:hAnsi="Times New Roman" w:cs="Times New Roman" w:hint="eastAsia"/>
+          <w:rFonts w:ascii="Times New Roman" w:hAnsi="Times New Roman" w:cs="Times New Roman"/>
         </w:rPr>
         <w:t>[n.]</w:t>
       </w:r>
@@ -32,23 +32,23 @@
     <w:p>
       <w:pPr>
         <w:rPr>
-          <w:rFonts w:ascii="Times New Roman" w:hAnsi="Times New Roman" w:cs="Times New Roman" w:hint="eastAsia"/>
+          <w:rFonts w:ascii="Times New Roman" w:hAnsi="Times New Roman" w:cs="Times New Roman"/>
           <w:b/>
         </w:rPr>
       </w:pPr>
       <w:r>
         <w:rPr>
-          <w:rFonts w:ascii="Arial" w:hAnsi="Arial" w:cs="Arial"/>
+          <w:rFonts w:ascii="Times New Roman" w:hAnsi="Times New Roman" w:cs="Times New Roman"/>
           <w:color w:val="202122"/>
           <w:shd w:val="clear" w:color="auto" w:fill="FFFFFF"/>
         </w:rPr>
         <w:t>In </w:t>
       </w:r>
-      <w:hyperlink r:id="rId5" w:tooltip="Mathematics" w:history="1">
+      <w:hyperlink r:id="rId4" w:tooltip="Mathematics" w:history="1">
         <w:r>
           <w:rPr>
             <w:rStyle w:val="a3"/>
-            <w:rFonts w:ascii="Arial" w:hAnsi="Arial" w:cs="Arial"/>
+            <w:rFonts w:ascii="Times New Roman" w:hAnsi="Times New Roman" w:cs="Times New Roman"/>
             <w:color w:val="3366CC"/>
             <w:u w:val="none"/>
             <w:shd w:val="clear" w:color="auto" w:fill="FFFFFF"/>
@@ -58,17 +58,17 @@
       </w:hyperlink>
       <w:r>
         <w:rPr>
-          <w:rFonts w:ascii="Arial" w:hAnsi="Arial" w:cs="Arial"/>
+          <w:rFonts w:ascii="Times New Roman" w:hAnsi="Times New Roman" w:cs="Times New Roman"/>
           <w:color w:val="202122"/>
           <w:shd w:val="clear" w:color="auto" w:fill="FFFFFF"/>
         </w:rPr>
         <w:t>, </w:t>
       </w:r>
-      <w:hyperlink r:id="rId6" w:tooltip="Orthogonality (mathematics)" w:history="1">
+      <w:hyperlink r:id="rId5" w:tooltip="Orthogonality (mathematics)" w:history="1">
         <w:r>
           <w:rPr>
             <w:rStyle w:val="a3"/>
-            <w:rFonts w:ascii="Arial" w:hAnsi="Arial" w:cs="Arial"/>
+            <w:rFonts w:ascii="Times New Roman" w:hAnsi="Times New Roman" w:cs="Times New Roman"/>
             <w:b/>
             <w:bCs/>
             <w:color w:val="3366CC"/>
@@ -80,17 +80,17 @@
       </w:hyperlink>
       <w:r>
         <w:rPr>
-          <w:rFonts w:ascii="Arial" w:hAnsi="Arial" w:cs="Arial"/>
+          <w:rFonts w:ascii="Times New Roman" w:hAnsi="Times New Roman" w:cs="Times New Roman"/>
           <w:color w:val="202122"/>
           <w:shd w:val="clear" w:color="auto" w:fill="FFFFFF"/>
         </w:rPr>
         <w:t> is the generalization of the geometric notion of </w:t>
       </w:r>
-      <w:hyperlink r:id="rId7" w:tooltip="Perpendicularity" w:history="1">
+      <w:hyperlink r:id="rId6" w:tooltip="Perpendicularity" w:history="1">
         <w:r>
           <w:rPr>
             <w:rStyle w:val="a3"/>
-            <w:rFonts w:ascii="Arial" w:hAnsi="Arial" w:cs="Arial"/>
+            <w:rFonts w:ascii="Times New Roman" w:hAnsi="Times New Roman" w:cs="Times New Roman"/>
             <w:i/>
             <w:iCs/>
             <w:color w:val="3366CC"/>
@@ -102,7 +102,7 @@
       </w:hyperlink>
       <w:r>
         <w:rPr>
-          <w:rFonts w:ascii="Arial" w:hAnsi="Arial" w:cs="Arial"/>
+          <w:rFonts w:ascii="Times New Roman" w:hAnsi="Times New Roman" w:cs="Times New Roman"/>
           <w:color w:val="202122"/>
           <w:shd w:val="clear" w:color="auto" w:fill="FFFFFF"/>
         </w:rPr>
@@ -110,7 +110,7 @@
       </w:r>
       <w:r>
         <w:rPr>
-          <w:rFonts w:ascii="Arial" w:hAnsi="Arial" w:cs="Arial" w:hint="eastAsia"/>
+          <w:rFonts w:ascii="Times New Roman" w:hAnsi="Times New Roman" w:cs="Times New Roman"/>
           <w:color w:val="202122"/>
           <w:shd w:val="clear" w:color="auto" w:fill="FFFFFF"/>
         </w:rPr>
@@ -121,11 +121,13 @@
       <w:pPr>
         <w:rPr>
           <w:rFonts w:ascii="Times New Roman" w:hAnsi="Times New Roman" w:cs="Times New Roman"/>
+          <w:color w:val="202122"/>
+          <w:shd w:val="clear" w:color="auto" w:fill="FFFFFF"/>
         </w:rPr>
       </w:pPr>
       <w:r>
         <w:rPr>
-          <w:rFonts w:ascii="Arial" w:hAnsi="Arial" w:cs="Arial" w:hint="eastAsia"/>
+          <w:rFonts w:ascii="Times New Roman" w:hAnsi="Times New Roman" w:cs="Times New Roman"/>
           <w:color w:val="202122"/>
           <w:shd w:val="clear" w:color="auto" w:fill="FFFFFF"/>
         </w:rPr>
@@ -135,11 +137,44 @@
       <w:bookmarkEnd w:id="0"/>
       <w:r>
         <w:rPr>
-          <w:rFonts w:ascii="Arial" w:hAnsi="Arial" w:cs="Arial" w:hint="eastAsia"/>
+          <w:rFonts w:ascii="Times New Roman" w:hAnsi="Times New Roman" w:cs="Times New Roman"/>
           <w:color w:val="202122"/>
           <w:shd w:val="clear" w:color="auto" w:fill="FFFFFF"/>
         </w:rPr>
         <w:t>te independantly without interfering with each other.</w:t>
+      </w:r>
+    </w:p>
+    <w:p>
+      <w:pPr>
+        <w:rPr>
+          <w:rFonts w:ascii="Times New Roman" w:hAnsi="Times New Roman" w:cs="Times New Roman"/>
+        </w:rPr>
+      </w:pPr>
+      <w:r>
+        <w:rPr>
+          <w:rFonts w:ascii="Times New Roman" w:hAnsi="Times New Roman" w:cs="Times New Roman"/>
+          <w:b/>
+          <w:color w:val="202122"/>
+          <w:shd w:val="clear" w:color="auto" w:fill="FFFFFF"/>
+        </w:rPr>
+        <w:t>unforgiving</w:t>
+      </w:r>
+      <w:r>
+        <w:rPr>
+          <w:rFonts w:ascii="Times New Roman" w:hAnsi="Times New Roman" w:cs="Times New Roman"/>
+          <w:color w:val="202122"/>
+          <w:shd w:val="clear" w:color="auto" w:fill="FFFFFF"/>
+        </w:rPr>
+        <w:br/>
+        <w:t>[adj.]</w:t>
+      </w:r>
+      <w:r>
+        <w:rPr>
+          <w:rFonts w:ascii="Times New Roman" w:hAnsi="Times New Roman" w:cs="Times New Roman" w:hint="eastAsia"/>
+          <w:color w:val="202122"/>
+          <w:shd w:val="clear" w:color="auto" w:fill="FFFFFF"/>
+        </w:rPr>
+        <w:t xml:space="preserve"> unwilling to forgive somedoby when they have done something wrong. </w:t>
       </w:r>
     </w:p>
     <w:sectPr>
@@ -153,7 +188,7 @@
 </file>
 
 <file path=word/styles.xml><?xml version="1.0" encoding="utf-8"?>
-<w:styles xmlns:mc="http://schemas.openxmlformats.org/markup-compatibility/2006" xmlns:r="http://schemas.openxmlformats.org/officeDocument/2006/relationships" xmlns:w="http://schemas.openxmlformats.org/wordprocessingml/2006/main" xmlns:w14="http://schemas.microsoft.com/office/word/2010/wordml" mc:Ignorable="w14">
+<w:styles xmlns:r="http://schemas.openxmlformats.org/officeDocument/2006/relationships" xmlns:w="http://schemas.openxmlformats.org/wordprocessingml/2006/main">
   <w:docDefaults>
     <w:rPrDefault>
       <w:rPr>
@@ -311,6 +346,7 @@
   <w:style w:type="paragraph" w:default="1" w:styleId="a">
     <w:name w:val="Normal"/>
     <w:qFormat/>
+    <w:rsid w:val="005B49F0"/>
   </w:style>
   <w:style w:type="character" w:default="1" w:styleId="a0">
     <w:name w:val="Default Paragraph Font"/>
@@ -323,6 +359,7 @@
     <w:uiPriority w:val="99"/>
     <w:semiHidden/>
     <w:unhideWhenUsed/>
+    <w:qFormat/>
     <w:tblPr>
       <w:tblInd w:w="0" w:type="dxa"/>
       <w:tblCellMar>

</xml_diff>